<commit_message>
feat: expand official seismic sources and improve global feed
</commit_message>
<xml_diff>
--- a/output/doc/01_Informe_de_Alcance_y_Diseno_Funcional_de_la_Plataforma_de_Visualizacion_Sismica.docx
+++ b/output/doc/01_Informe_de_Alcance_y_Diseno_Funcional_de_la_Plataforma_de_Visualizacion_Sismica.docx
@@ -45,7 +45,7 @@
         <w:jc w:val="center"/>
       </w:pPr>
       <w:r>
-        <w:t>Versión 1.3 - Junio de 2026</w:t>
+        <w:t>Versión 1.5 - Junio de 2026</w:t>
       </w:r>
     </w:p>
     <w:p>
@@ -611,7 +611,7 @@
           </w:tcPr>
           <w:p>
             <w:r>
-              <w:t>Versión 1.3 incorpora GEOFON y GeoNet, actualiza la evaluación de DHN/CNAT, SGC, CSN e ISC, y conserva GlobalQuake únicamente como referente funcional de visualización.</w:t>
+              <w:t>Versi?n 1.6 incorpora CWA como fuente oficial preferida para Taiwan, documenta identidad por Web, prioridad regional corregida y actualiza la evidencia a doce fuentes y veinte pruebas.</w:t>
             </w:r>
           </w:p>
         </w:tc>
@@ -764,6 +764,22 @@
       </w:pPr>
       <w:r>
         <w:t>15. Referencias</w:t>
+      </w:r>
+    </w:p>
+    <w:p>
+      <w:pPr>
+        <w:pStyle w:val="ListBullet"/>
+      </w:pPr>
+      <w:r>
+        <w:t>16. Ampliación de fuentes oficiales</w:t>
+      </w:r>
+    </w:p>
+    <w:p>
+      <w:pPr>
+        <w:pStyle w:val="ListBullet"/>
+      </w:pPr>
+      <w:r>
+        <w:t>17. Referencias complementarias</w:t>
       </w:r>
     </w:p>
     <w:p>
@@ -1099,7 +1115,7 @@
               <w:rPr>
                 <w:sz w:val="18"/>
               </w:rPr>
-              <w:t>Consumo de USGS, EMSC, IGP/CENSIS, FUNVISIS, GEOFON, GeoNet, GDACS y productos NOAA/PTWC/NTWC segun el dominio de cada fuente.</w:t>
+              <w:t>Consumo de USGS, EMSC, IGP/CENSIS, FUNVISIS, GEOFON, GeoNet, BMKG, JMA, GDACS y productos NOAA/PTWC/NTWC segun el dominio de cada fuente.</w:t>
             </w:r>
             <w:r>
               <w:rPr>
@@ -2252,6 +2268,48 @@
           <w:p>
             <w:r>
               <w:t>Aislar el adaptador y monitorear cambios porque el endpoint utilizado por el portal no publica una especificacion versionada.</w:t>
+            </w:r>
+          </w:p>
+        </w:tc>
+      </w:tr>
+      <w:tr>
+        <w:tc>
+          <w:tcPr>
+            <w:tcW w:type="dxa" w:w="2448"/>
+          </w:tcPr>
+          <w:p>
+            <w:r>
+              <w:t>CWA / Taiwan</w:t>
+            </w:r>
+          </w:p>
+        </w:tc>
+        <w:tc>
+          <w:tcPr>
+            <w:tcW w:type="dxa" w:w="2448"/>
+          </w:tcPr>
+          <w:p>
+            <w:r>
+              <w:t>Fuente nacional oficial prioritaria para eventos en Taiwan.</w:t>
+            </w:r>
+          </w:p>
+        </w:tc>
+        <w:tc>
+          <w:tcPr>
+            <w:tcW w:type="dxa" w:w="2448"/>
+          </w:tcPr>
+          <w:p>
+            <w:r>
+              <w:t>Reporte s?smico oficial con magnitud, profundidad, epicentro, intensidad m?xima y detalle del evento.</w:t>
+            </w:r>
+          </w:p>
+        </w:tc>
+        <w:tc>
+          <w:tcPr>
+            <w:tcW w:type="dxa" w:w="2448"/>
+          </w:tcPr>
+          <w:p>
+            <w:r>
+              <w:t>Requiere credencial institucional; autenticar solo en backend y no usar EarthquakeNo como clave ?nica.</w:t>
             </w:r>
           </w:p>
         </w:tc>
@@ -2625,7 +2683,7 @@
         <w:pStyle w:val="ListBullet"/>
       </w:pPr>
       <w:r>
-        <w:t>Plano de datos verificables: USGS, EMSC, IGP/CENSIS, FUNVISIS, GEOFON, GeoNet, GDACS y NOAA/PTWC/NTWC mediante sus canales publicos permitidos.</w:t>
+        <w:t>Plano de datos verificables: USGS, EMSC, IGP/CENSIS, FUNVISIS, GEOFON, GeoNet, BMKG, JMA, GDACS y NOAA/PTWC/NTWC mediante sus canales públicos permitidos.</w:t>
       </w:r>
     </w:p>
     <w:p>
@@ -2683,7 +2741,7 @@
         <w:pStyle w:val="ListBullet"/>
       </w:pPr>
       <w:r>
-        <w:t>Canal en vivo (SSE/WebSocket) que empuja los eventos nuevos al mapa sin recargar la página; la fuente EMSC ofrece además un WebSocket de tiempo real.</w:t>
+        <w:t>Canal en vivo (SSE) que empuja los eventos nuevos al mapa sin recargar la página; la fuente EMSC ofrece además un WebSocket de tiempo real.</w:t>
       </w:r>
     </w:p>
     <w:p>
@@ -4468,7 +4526,7 @@
         <w:spacing w:after="120" w:line="259" w:lineRule="auto"/>
       </w:pPr>
       <w:r>
-        <w:t>Evolución multifuente completada: EMSC, IGP/CENSIS, FUNVISIS, GEOFON, GeoNet, GDACS y capa NOAA/PTWC/NTWC con deduplicación y trazabilidad.</w:t>
+        <w:t>Evolución multifuente completada: EMSC, IGP/CENSIS, FUNVISIS, GEOFON, GeoNet, BMKG, JMA, GDACS y capa NOAA/PTWC/NTWC con deduplicación y trazabilidad.</w:t>
       </w:r>
     </w:p>
     <w:p>
@@ -4658,11 +4716,6 @@
       </w:r>
     </w:p>
     <w:p>
-      <w:r>
-        <w:br w:type="page"/>
-      </w:r>
-    </w:p>
-    <w:p>
       <w:pPr>
         <w:pStyle w:val="Heading1"/>
       </w:pPr>
@@ -4924,7 +4977,7 @@
       <w:tr>
         <w:tc>
           <w:tcPr>
-            <w:tcW w:type="dxa" w:w="1800"/>
+            <w:tcW w:type="dxa" w:w="2448"/>
             <w:vAlign w:val="top"/>
           </w:tcPr>
           <w:p>
@@ -4935,13 +4988,13 @@
               <w:rPr>
                 <w:sz w:val="17"/>
               </w:rPr>
-              <w:t>ISC</w:t>
+              <w:t>BMKG Indonesia</w:t>
             </w:r>
           </w:p>
         </w:tc>
         <w:tc>
           <w:tcPr>
-            <w:tcW w:type="dxa" w:w="2880"/>
+            <w:tcW w:type="dxa" w:w="2448"/>
             <w:vAlign w:val="top"/>
           </w:tcPr>
           <w:p>
@@ -4952,13 +5005,13 @@
               <w:rPr>
                 <w:sz w:val="17"/>
               </w:rPr>
-              <w:t>Boletín global revisado e histórico</w:t>
+              <w:t>Sismicidad, intensidad sentida y potencial de tsunami</w:t>
             </w:r>
           </w:p>
         </w:tc>
         <w:tc>
           <w:tcPr>
-            <w:tcW w:type="dxa" w:w="3240"/>
+            <w:tcW w:type="dxa" w:w="2448"/>
             <w:vAlign w:val="top"/>
           </w:tcPr>
           <w:p>
@@ -4969,13 +5022,13 @@
               <w:rPr>
                 <w:sz w:val="17"/>
               </w:rPr>
-              <w:t>La revisión consolidada no es inmediata</w:t>
+              <w:t>Feeds JSON oficiales, públicos y operativos</w:t>
             </w:r>
           </w:p>
         </w:tc>
         <w:tc>
           <w:tcPr>
-            <w:tcW w:type="dxa" w:w="2592"/>
+            <w:tcW w:type="dxa" w:w="2448"/>
             <w:vAlign w:val="top"/>
           </w:tcPr>
           <w:p>
@@ -4986,7 +5039,77 @@
               <w:rPr>
                 <w:sz w:val="17"/>
               </w:rPr>
-              <w:t>Reconciliación histórica futura</w:t>
+              <w:t>Integrada</w:t>
+            </w:r>
+          </w:p>
+        </w:tc>
+      </w:tr>
+      <w:tr>
+        <w:tc>
+          <w:tcPr>
+            <w:tcW w:type="dxa" w:w="2448"/>
+            <w:vAlign w:val="top"/>
+          </w:tcPr>
+          <w:p>
+            <w:pPr>
+              <w:spacing w:after="0"/>
+            </w:pPr>
+            <w:r>
+              <w:rPr>
+                <w:sz w:val="17"/>
+              </w:rPr>
+              <w:t>JMA Japón</w:t>
+            </w:r>
+          </w:p>
+        </w:tc>
+        <w:tc>
+          <w:tcPr>
+            <w:tcW w:type="dxa" w:w="2448"/>
+            <w:vAlign w:val="top"/>
+          </w:tcPr>
+          <w:p>
+            <w:pPr>
+              <w:spacing w:after="0"/>
+            </w:pPr>
+            <w:r>
+              <w:rPr>
+                <w:sz w:val="17"/>
+              </w:rPr>
+              <w:t>Sismicidad e intensidad Shindo de Japón</w:t>
+            </w:r>
+          </w:p>
+        </w:tc>
+        <w:tc>
+          <w:tcPr>
+            <w:tcW w:type="dxa" w:w="2448"/>
+            <w:vAlign w:val="top"/>
+          </w:tcPr>
+          <w:p>
+            <w:pPr>
+              <w:spacing w:after="0"/>
+            </w:pPr>
+            <w:r>
+              <w:rPr>
+                <w:sz w:val="17"/>
+              </w:rPr>
+              <w:t>Feed JSON oficial operativo; sin SLA publicado</w:t>
+            </w:r>
+          </w:p>
+        </w:tc>
+        <w:tc>
+          <w:tcPr>
+            <w:tcW w:type="dxa" w:w="2448"/>
+            <w:vAlign w:val="top"/>
+          </w:tcPr>
+          <w:p>
+            <w:pPr>
+              <w:spacing w:after="0"/>
+            </w:pPr>
+            <w:r>
+              <w:rPr>
+                <w:sz w:val="17"/>
+              </w:rPr>
+              <w:t>Integrada con monitoreo</w:t>
             </w:r>
           </w:p>
         </w:tc>
@@ -5005,7 +5128,7 @@
               <w:rPr>
                 <w:sz w:val="17"/>
               </w:rPr>
-              <w:t>DHN/CNAT Perú</w:t>
+              <w:t>ISC</w:t>
             </w:r>
           </w:p>
         </w:tc>
@@ -5022,7 +5145,7 @@
               <w:rPr>
                 <w:sz w:val="17"/>
               </w:rPr>
-              <w:t>Boletines oficiales de tsunami para el litoral peruano</w:t>
+              <w:t>Boletín global revisado e histórico</w:t>
             </w:r>
           </w:p>
         </w:tc>
@@ -5039,7 +5162,7 @@
               <w:rPr>
                 <w:sz w:val="17"/>
               </w:rPr>
-              <w:t>No se localizó API pública documentada</w:t>
+              <w:t>La revisión consolidada no es inmediata</w:t>
             </w:r>
           </w:p>
         </w:tc>
@@ -5056,7 +5179,7 @@
               <w:rPr>
                 <w:sz w:val="17"/>
               </w:rPr>
-              <w:t>Acceso institucional pendiente</w:t>
+              <w:t>Reconciliación histórica futura</w:t>
             </w:r>
           </w:p>
         </w:tc>
@@ -5075,7 +5198,7 @@
               <w:rPr>
                 <w:sz w:val="17"/>
               </w:rPr>
-              <w:t>SGC Colombia</w:t>
+              <w:t>DHN/CNAT Perú</w:t>
             </w:r>
           </w:p>
         </w:tc>
@@ -5092,7 +5215,7 @@
               <w:rPr>
                 <w:sz w:val="17"/>
               </w:rPr>
-              <w:t>Catálogo sísmico nacional</w:t>
+              <w:t>Boletines oficiales de tsunami para el litoral peruano</w:t>
             </w:r>
           </w:p>
         </w:tc>
@@ -5109,7 +5232,7 @@
               <w:rPr>
                 <w:sz w:val="17"/>
               </w:rPr>
-              <w:t>El ArcGIS público evaluado finaliza en 2020</w:t>
+              <w:t>No se localizó API pública documentada</w:t>
             </w:r>
           </w:p>
         </w:tc>
@@ -5126,7 +5249,7 @@
               <w:rPr>
                 <w:sz w:val="17"/>
               </w:rPr>
-              <w:t>Endpoint vigente pendiente</w:t>
+              <w:t>Acceso institucional pendiente</w:t>
             </w:r>
           </w:p>
         </w:tc>
@@ -5145,7 +5268,7 @@
               <w:rPr>
                 <w:sz w:val="17"/>
               </w:rPr>
-              <w:t>CSN Chile</w:t>
+              <w:t>SGC Colombia</w:t>
             </w:r>
           </w:p>
         </w:tc>
@@ -5162,7 +5285,7 @@
               <w:rPr>
                 <w:sz w:val="17"/>
               </w:rPr>
-              <w:t>Red, estaciones y formas de onda</w:t>
+              <w:t>Catálogo sísmico nacional</w:t>
             </w:r>
           </w:p>
         </w:tc>
@@ -5179,7 +5302,7 @@
               <w:rPr>
                 <w:sz w:val="17"/>
               </w:rPr>
-              <w:t>FDSN público sin servicio Event confirmado</w:t>
+              <w:t>El ArcGIS público evaluado finaliza en 2020</w:t>
             </w:r>
           </w:p>
         </w:tc>
@@ -5196,7 +5319,119 @@
               <w:rPr>
                 <w:sz w:val="17"/>
               </w:rPr>
+              <w:t>Endpoint vigente pendiente</w:t>
+            </w:r>
+          </w:p>
+        </w:tc>
+      </w:tr>
+      <w:tr>
+        <w:tc>
+          <w:tcPr>
+            <w:tcW w:type="dxa" w:w="1800"/>
+            <w:vAlign w:val="top"/>
+          </w:tcPr>
+          <w:p>
+            <w:pPr>
+              <w:spacing w:after="0"/>
+            </w:pPr>
+            <w:r>
+              <w:rPr>
+                <w:sz w:val="17"/>
+              </w:rPr>
+              <w:t>CSN Chile</w:t>
+            </w:r>
+          </w:p>
+        </w:tc>
+        <w:tc>
+          <w:tcPr>
+            <w:tcW w:type="dxa" w:w="2880"/>
+            <w:vAlign w:val="top"/>
+          </w:tcPr>
+          <w:p>
+            <w:pPr>
+              <w:spacing w:after="0"/>
+            </w:pPr>
+            <w:r>
+              <w:rPr>
+                <w:sz w:val="17"/>
+              </w:rPr>
+              <w:t>Red, estaciones y formas de onda</w:t>
+            </w:r>
+          </w:p>
+        </w:tc>
+        <w:tc>
+          <w:tcPr>
+            <w:tcW w:type="dxa" w:w="3240"/>
+            <w:vAlign w:val="top"/>
+          </w:tcPr>
+          <w:p>
+            <w:pPr>
+              <w:spacing w:after="0"/>
+            </w:pPr>
+            <w:r>
+              <w:rPr>
+                <w:sz w:val="17"/>
+              </w:rPr>
+              <w:t>FDSN público sin servicio Event confirmado</w:t>
+            </w:r>
+          </w:p>
+        </w:tc>
+        <w:tc>
+          <w:tcPr>
+            <w:tcW w:type="dxa" w:w="2592"/>
+            <w:vAlign w:val="top"/>
+          </w:tcPr>
+          <w:p>
+            <w:pPr>
+              <w:spacing w:after="0"/>
+            </w:pPr>
+            <w:r>
+              <w:rPr>
+                <w:sz w:val="17"/>
+              </w:rPr>
               <w:t>Endpoint de eventos pendiente</w:t>
+            </w:r>
+          </w:p>
+        </w:tc>
+      </w:tr>
+      <w:tr>
+        <w:tc>
+          <w:tcPr>
+            <w:tcW w:type="dxa" w:w="2448"/>
+          </w:tcPr>
+          <w:p>
+            <w:r>
+              <w:t>CWA Taiwan</w:t>
+            </w:r>
+          </w:p>
+        </w:tc>
+        <w:tc>
+          <w:tcPr>
+            <w:tcW w:type="dxa" w:w="2448"/>
+          </w:tcPr>
+          <w:p>
+            <w:r>
+              <w:t>Sismicidad e intensidad oficial de Taiwan</w:t>
+            </w:r>
+          </w:p>
+        </w:tc>
+        <w:tc>
+          <w:tcPr>
+            <w:tcW w:type="dxa" w:w="2448"/>
+          </w:tcPr>
+          <w:p>
+            <w:r>
+              <w:t>Recurso E-A0016-002 autenticado por header; EarthquakeNo no es ?nico</w:t>
+            </w:r>
+          </w:p>
+        </w:tc>
+        <w:tc>
+          <w:tcPr>
+            <w:tcW w:type="dxa" w:w="2448"/>
+          </w:tcPr>
+          <w:p>
+            <w:r>
+              <w:t>Integrada con credencial y monitoreo</w:t>
             </w:r>
           </w:p>
         </w:tc>
@@ -5339,14 +5574,8 @@
             <w:vAlign w:val="top"/>
           </w:tcPr>
           <w:p>
-            <w:pPr>
-              <w:spacing w:after="0"/>
-            </w:pPr>
-            <w:r>
-              <w:rPr>
-                <w:sz w:val="17"/>
-              </w:rPr>
-              <w:t>Nueve fuentes operativas o auxiliares visibles por API</w:t>
+            <w:r>
+              <w:t>Doce fuentes operativas o auxiliares visibles por API</w:t>
             </w:r>
           </w:p>
         </w:tc>
@@ -5426,7 +5655,7 @@
       <w:tr>
         <w:tc>
           <w:tcPr>
-            <w:tcW w:type="dxa" w:w="3168"/>
+            <w:tcW w:type="dxa" w:w="4896"/>
             <w:vAlign w:val="top"/>
           </w:tcPr>
           <w:p>
@@ -5437,13 +5666,13 @@
               <w:rPr>
                 <w:sz w:val="17"/>
               </w:rPr>
-              <w:t>Unicidad</w:t>
+              <w:t>BMKG</w:t>
             </w:r>
           </w:p>
         </w:tc>
         <w:tc>
           <w:tcPr>
-            <w:tcW w:type="dxa" w:w="7344"/>
+            <w:tcW w:type="dxa" w:w="4896"/>
             <w:vAlign w:val="top"/>
           </w:tcPr>
           <w:p>
@@ -5454,7 +5683,43 @@
               <w:rPr>
                 <w:sz w:val="17"/>
               </w:rPr>
-              <w:t>Cero duplicados por fuente e identificador</w:t>
+              <w:t>3 referencias; 2 asociaciones y 1 evento nuevo; reingesta idempotente</w:t>
+            </w:r>
+          </w:p>
+        </w:tc>
+      </w:tr>
+      <w:tr>
+        <w:tc>
+          <w:tcPr>
+            <w:tcW w:type="dxa" w:w="4896"/>
+            <w:vAlign w:val="top"/>
+          </w:tcPr>
+          <w:p>
+            <w:pPr>
+              <w:spacing w:after="0"/>
+            </w:pPr>
+            <w:r>
+              <w:rPr>
+                <w:sz w:val="17"/>
+              </w:rPr>
+              <w:t>JMA</w:t>
+            </w:r>
+          </w:p>
+        </w:tc>
+        <w:tc>
+          <w:tcPr>
+            <w:tcW w:type="dxa" w:w="4896"/>
+            <w:vAlign w:val="top"/>
+          </w:tcPr>
+          <w:p>
+            <w:pPr>
+              <w:spacing w:after="0"/>
+            </w:pPr>
+            <w:r>
+              <w:rPr>
+                <w:sz w:val="17"/>
+              </w:rPr>
+              <w:t>16 referencias; 11 asociaciones y 5 eventos nuevos; reingesta idempotente</w:t>
             </w:r>
           </w:p>
         </w:tc>
@@ -5473,7 +5738,7 @@
               <w:rPr>
                 <w:sz w:val="17"/>
               </w:rPr>
-              <w:t>Verificación automatizada</w:t>
+              <w:t>Unicidad</w:t>
             </w:r>
           </w:p>
         </w:tc>
@@ -5490,7 +5755,59 @@
               <w:rPr>
                 <w:sz w:val="17"/>
               </w:rPr>
-              <w:t>10 pruebas correctas, typecheck correcto y build correcto</w:t>
+              <w:t>Cero duplicados por fuente e identificador</w:t>
+            </w:r>
+          </w:p>
+        </w:tc>
+      </w:tr>
+      <w:tr>
+        <w:tc>
+          <w:tcPr>
+            <w:tcW w:type="dxa" w:w="3168"/>
+            <w:vAlign w:val="top"/>
+          </w:tcPr>
+          <w:p>
+            <w:pPr>
+              <w:spacing w:after="0"/>
+            </w:pPr>
+            <w:r>
+              <w:rPr>
+                <w:sz w:val="17"/>
+              </w:rPr>
+              <w:t>Verificación automatizada</w:t>
+            </w:r>
+          </w:p>
+        </w:tc>
+        <w:tc>
+          <w:tcPr>
+            <w:tcW w:type="dxa" w:w="7344"/>
+            <w:vAlign w:val="top"/>
+          </w:tcPr>
+          <w:p>
+            <w:r>
+              <w:t>20 pruebas correctas, typecheck correcto y build correcto</w:t>
+            </w:r>
+          </w:p>
+        </w:tc>
+      </w:tr>
+      <w:tr>
+        <w:tc>
+          <w:tcPr>
+            <w:tcW w:type="dxa" w:w="4896"/>
+          </w:tcPr>
+          <w:p>
+            <w:r>
+              <w:t>CWA</w:t>
+            </w:r>
+          </w:p>
+        </w:tc>
+        <w:tc>
+          <w:tcPr>
+            <w:tcW w:type="dxa" w:w="4896"/>
+          </w:tcPr>
+          <w:p>
+            <w:r>
+              <w:t>2 referencias; 2 eventos nuevos; reingesta idempotente y 1 actualizaci?n controlada por correcci?n de prioridad</w:t>
             </w:r>
           </w:p>
         </w:tc>
@@ -5499,7 +5816,7 @@
     <w:p/>
     <w:p>
       <w:r>
-        <w:t>Los conteos son una evidencia de la ejecución del 30 de junio de 2026 y variarán con nuevas ingestas. La especificación aplicable es SDD-004 y la evidencia detallada se conserva en VALIDATION-004.</w:t>
+        <w:t>Los conteos son una evidencia de la ejecuci?n del 30 de junio de 2026 y variar?n con nuevas ingestas. Las especificaciones aplicables son SDD-004, SDD-005, SDD-006 y SDD-007; la evidencia se conserva en VALIDATION-004, VALIDATION-005, VALIDATION-006 y VALIDATION-007.</w:t>
       </w:r>
     </w:p>
     <w:p>
@@ -5592,6 +5909,39 @@
       </w:r>
       <w:r>
         <w:t>https://www.csn.uchile.cl/</w:t>
+      </w:r>
+    </w:p>
+    <w:p>
+      <w:pPr>
+        <w:pStyle w:val="ListBullet"/>
+      </w:pPr>
+      <w:r>
+        <w:rPr>
+          <w:b/>
+        </w:rPr>
+        <w:t xml:space="preserve">BMKG - Datos abiertos de terremotos: </w:t>
+      </w:r>
+      <w:r>
+        <w:t>https://data.bmkg.go.id/gempabumi/</w:t>
+      </w:r>
+    </w:p>
+    <w:p>
+      <w:pPr>
+        <w:pStyle w:val="ListBullet"/>
+      </w:pPr>
+      <w:r>
+        <w:rPr>
+          <w:b/>
+        </w:rPr>
+        <w:t xml:space="preserve">JMA - Información de terremotos: </w:t>
+      </w:r>
+      <w:r>
+        <w:t>https://www.jma.go.jp/bosai/map.html#contents=earthquake</w:t>
+      </w:r>
+    </w:p>
+    <w:p>
+      <w:r>
+        <w:t>CWA Taiwan - Earthquake Report E-A0016-002: https://opendata.cwa.gov.tw/</w:t>
       </w:r>
     </w:p>
     <w:sectPr>

</xml_diff>

<commit_message>
feat: add station monitoring and operational map updates
</commit_message>
<xml_diff>
--- a/output/doc/01_Informe_de_Alcance_y_Diseno_Funcional_de_la_Plataforma_de_Visualizacion_Sismica.docx
+++ b/output/doc/01_Informe_de_Alcance_y_Diseno_Funcional_de_la_Plataforma_de_Visualizacion_Sismica.docx
@@ -45,7 +45,7 @@
         <w:jc w:val="center"/>
       </w:pPr>
       <w:r>
-        <w:t>Versión 1.5 - Junio de 2026</w:t>
+        <w:t>Versión 1.7 - Junio de 2026</w:t>
       </w:r>
     </w:p>
     <w:p>
@@ -611,7 +611,7 @@
           </w:tcPr>
           <w:p>
             <w:r>
-              <w:t>Versi?n 1.6 incorpora CWA como fuente oficial preferida para Taiwan, documenta identidad por Web, prioridad regional corregida y actualiza la evidencia a doce fuentes y veinte pruebas.</w:t>
+              <w:t>Versión 1.7 incorpora el alcance funcional del subsistema experimental de estaciones, propagación P/S, integración con un motor científico externo y límites explícitos respecto de alertas oficiales.</w:t>
             </w:r>
           </w:p>
         </w:tc>
@@ -780,6 +780,15 @@
       </w:pPr>
       <w:r>
         <w:t>17. Referencias complementarias</w:t>
+      </w:r>
+    </w:p>
+    <w:p/>
+    <w:p>
+      <w:pPr>
+        <w:pStyle w:val="ListBullet"/>
+      </w:pPr>
+      <w:r>
+        <w:t>18. Subsistema experimental de estaciones y propagación sísmica</w:t>
       </w:r>
     </w:p>
     <w:p>
@@ -2299,7 +2308,7 @@
           </w:tcPr>
           <w:p>
             <w:r>
-              <w:t>Reporte s?smico oficial con magnitud, profundidad, epicentro, intensidad m?xima y detalle del evento.</w:t>
+              <w:t>Reporte sísmico oficial con magnitud, profundidad, epicentro, intensidad máxima y detalle del evento.</w:t>
             </w:r>
           </w:p>
         </w:tc>
@@ -2309,7 +2318,7 @@
           </w:tcPr>
           <w:p>
             <w:r>
-              <w:t>Requiere credencial institucional; autenticar solo en backend y no usar EarthquakeNo como clave ?nica.</w:t>
+              <w:t>Requiere credencial institucional; autenticar solo en backend y no usar EarthquakeNo como clave única.</w:t>
             </w:r>
           </w:p>
         </w:tc>
@@ -5421,7 +5430,7 @@
           </w:tcPr>
           <w:p>
             <w:r>
-              <w:t>Recurso E-A0016-002 autenticado por header; EarthquakeNo no es ?nico</w:t>
+              <w:t>Recurso E-A0016-002 autenticado por header; EarthquakeNo no es único</w:t>
             </w:r>
           </w:p>
         </w:tc>
@@ -5807,7 +5816,7 @@
           </w:tcPr>
           <w:p>
             <w:r>
-              <w:t>2 referencias; 2 eventos nuevos; reingesta idempotente y 1 actualizaci?n controlada por correcci?n de prioridad</w:t>
+              <w:t>2 referencias; 2 eventos nuevos; reingesta idempotente y 1 actualización controlada por corrección de prioridad</w:t>
             </w:r>
           </w:p>
         </w:tc>
@@ -5816,7 +5825,7 @@
     <w:p/>
     <w:p>
       <w:r>
-        <w:t>Los conteos son una evidencia de la ejecuci?n del 30 de junio de 2026 y variar?n con nuevas ingestas. Las especificaciones aplicables son SDD-004, SDD-005, SDD-006 y SDD-007; la evidencia se conserva en VALIDATION-004, VALIDATION-005, VALIDATION-006 y VALIDATION-007.</w:t>
+        <w:t>Los conteos son una evidencia de la ejecución del 30 de junio de 2026 y variarán con nuevas ingestas. Las especificaciones aplicables son SDD-004, SDD-005, SDD-006 y SDD-007; la evidencia se conserva en VALIDATION-004, VALIDATION-005, VALIDATION-006 y VALIDATION-007.</w:t>
       </w:r>
     </w:p>
     <w:p>
@@ -5942,6 +5951,525 @@
     <w:p>
       <w:r>
         <w:t>CWA Taiwan - Earthquake Report E-A0016-002: https://opendata.cwa.gov.tw/</w:t>
+      </w:r>
+    </w:p>
+    <w:p>
+      <w:r>
+        <w:br w:type="page"/>
+      </w:r>
+    </w:p>
+    <w:p>
+      <w:pPr>
+        <w:pStyle w:val="Heading1"/>
+      </w:pPr>
+      <w:r>
+        <w:t>18. Subsistema experimental de estaciones y propagación sísmica</w:t>
+      </w:r>
+    </w:p>
+    <w:p>
+      <w:r>
+        <w:t>La plataforma incorpora un subsistema experimental orientado a visualizar estaciones sismológicas, representar su condición operativa y recibir resultados calculados por un motor científico externo. El propósito es aproximar la experiencia funcional de un monitor de formas de onda sin sustituir la información oficial del IGP/CENSIS, USGS, CSN u otras autoridades.</w:t>
+      </w:r>
+    </w:p>
+    <w:p>
+      <w:pPr>
+        <w:pStyle w:val="Heading2"/>
+      </w:pPr>
+      <w:r>
+        <w:t>18.1 Alcance funcional aprobado</w:t>
+      </w:r>
+    </w:p>
+    <w:tbl>
+      <w:tblPr>
+        <w:tblStyle w:val="TableGrid"/>
+        <w:tblW w:type="auto" w:w="0"/>
+        <w:tblLayout w:type="autofit"/>
+        <w:tblLook w:firstColumn="1" w:firstRow="1" w:lastColumn="0" w:lastRow="0" w:noHBand="0" w:noVBand="1" w:val="04A0"/>
+      </w:tblPr>
+      <w:tblGrid>
+        <w:gridCol w:w="3264"/>
+        <w:gridCol w:w="3264"/>
+        <w:gridCol w:w="3264"/>
+      </w:tblGrid>
+      <w:tr>
+        <w:tc>
+          <w:tcPr>
+            <w:tcW w:type="dxa" w:w="2438"/>
+            <w:shd w:fill="D9E2F3"/>
+          </w:tcPr>
+          <w:p>
+            <w:r>
+              <w:rPr>
+                <w:b/>
+                <w:sz w:val="18"/>
+              </w:rPr>
+              <w:t>Componente</w:t>
+            </w:r>
+          </w:p>
+        </w:tc>
+        <w:tc>
+          <w:tcPr>
+            <w:tcW w:type="dxa" w:w="1701"/>
+            <w:shd w:fill="D9E2F3"/>
+          </w:tcPr>
+          <w:p>
+            <w:r>
+              <w:rPr>
+                <w:b/>
+                <w:sz w:val="18"/>
+              </w:rPr>
+              <w:t>Incluido</w:t>
+            </w:r>
+          </w:p>
+        </w:tc>
+        <w:tc>
+          <w:tcPr>
+            <w:tcW w:type="dxa" w:w="5102"/>
+            <w:shd w:fill="D9E2F3"/>
+          </w:tcPr>
+          <w:p>
+            <w:r>
+              <w:rPr>
+                <w:b/>
+                <w:sz w:val="18"/>
+              </w:rPr>
+              <w:t>Responsabilidad</w:t>
+            </w:r>
+          </w:p>
+        </w:tc>
+      </w:tr>
+      <w:tr>
+        <w:tc>
+          <w:tcPr>
+            <w:tcW w:type="dxa" w:w="2438"/>
+          </w:tcPr>
+          <w:p>
+            <w:r>
+              <w:rPr>
+                <w:sz w:val="18"/>
+              </w:rPr>
+              <w:t>Catálogo de estaciones</w:t>
+            </w:r>
+          </w:p>
+        </w:tc>
+        <w:tc>
+          <w:tcPr>
+            <w:tcW w:type="dxa" w:w="1701"/>
+          </w:tcPr>
+          <w:p>
+            <w:r>
+              <w:rPr>
+                <w:sz w:val="18"/>
+              </w:rPr>
+              <w:t>Sí</w:t>
+            </w:r>
+          </w:p>
+        </w:tc>
+        <w:tc>
+          <w:tcPr>
+            <w:tcW w:type="dxa" w:w="5102"/>
+          </w:tcPr>
+          <w:p>
+            <w:r>
+              <w:rPr>
+                <w:sz w:val="18"/>
+              </w:rPr>
+              <w:t>Obtener metadatos FDSN, ubicación, red, periodo operativo y atribución.</w:t>
+            </w:r>
+          </w:p>
+        </w:tc>
+      </w:tr>
+      <w:tr>
+        <w:tc>
+          <w:tcPr>
+            <w:tcW w:type="dxa" w:w="2438"/>
+          </w:tcPr>
+          <w:p>
+            <w:r>
+              <w:rPr>
+                <w:sz w:val="18"/>
+              </w:rPr>
+              <w:t>Estado de estación</w:t>
+            </w:r>
+          </w:p>
+        </w:tc>
+        <w:tc>
+          <w:tcPr>
+            <w:tcW w:type="dxa" w:w="1701"/>
+          </w:tcPr>
+          <w:p>
+            <w:r>
+              <w:rPr>
+                <w:sz w:val="18"/>
+              </w:rPr>
+              <w:t>Sí</w:t>
+            </w:r>
+          </w:p>
+        </w:tc>
+        <w:tc>
+          <w:tcPr>
+            <w:tcW w:type="dxa" w:w="5102"/>
+          </w:tcPr>
+          <w:p>
+            <w:r>
+              <w:rPr>
+                <w:sz w:val="18"/>
+              </w:rPr>
+              <w:t>Mostrar estado desconocido, en línea, con retraso, fuera de línea o activado.</w:t>
+            </w:r>
+          </w:p>
+        </w:tc>
+      </w:tr>
+      <w:tr>
+        <w:tc>
+          <w:tcPr>
+            <w:tcW w:type="dxa" w:w="2438"/>
+          </w:tcPr>
+          <w:p>
+            <w:r>
+              <w:rPr>
+                <w:sz w:val="18"/>
+              </w:rPr>
+              <w:t>Propagación P/S</w:t>
+            </w:r>
+          </w:p>
+        </w:tc>
+        <w:tc>
+          <w:tcPr>
+            <w:tcW w:type="dxa" w:w="1701"/>
+          </w:tcPr>
+          <w:p>
+            <w:r>
+              <w:rPr>
+                <w:sz w:val="18"/>
+              </w:rPr>
+              <w:t>Sí</w:t>
+            </w:r>
+          </w:p>
+        </w:tc>
+        <w:tc>
+          <w:tcPr>
+            <w:tcW w:type="dxa" w:w="5102"/>
+          </w:tcPr>
+          <w:p>
+            <w:r>
+              <w:rPr>
+                <w:sz w:val="18"/>
+              </w:rPr>
+              <w:t>Representar frentes estimados con tiempo de origen, profundidad y velocidades configuradas.</w:t>
+            </w:r>
+          </w:p>
+        </w:tc>
+      </w:tr>
+      <w:tr>
+        <w:tc>
+          <w:tcPr>
+            <w:tcW w:type="dxa" w:w="2438"/>
+          </w:tcPr>
+          <w:p>
+            <w:r>
+              <w:rPr>
+                <w:sz w:val="18"/>
+              </w:rPr>
+              <w:t>Recepción científica</w:t>
+            </w:r>
+          </w:p>
+        </w:tc>
+        <w:tc>
+          <w:tcPr>
+            <w:tcW w:type="dxa" w:w="1701"/>
+          </w:tcPr>
+          <w:p>
+            <w:r>
+              <w:rPr>
+                <w:sz w:val="18"/>
+              </w:rPr>
+              <w:t>Sí, mediante adaptador</w:t>
+            </w:r>
+          </w:p>
+        </w:tc>
+        <w:tc>
+          <w:tcPr>
+            <w:tcW w:type="dxa" w:w="5102"/>
+          </w:tcPr>
+          <w:p>
+            <w:r>
+              <w:rPr>
+                <w:sz w:val="18"/>
+              </w:rPr>
+              <w:t>Aceptar estados, picks y orígenes experimentales producidos por SeisComP.</w:t>
+            </w:r>
+          </w:p>
+        </w:tc>
+      </w:tr>
+      <w:tr>
+        <w:tc>
+          <w:tcPr>
+            <w:tcW w:type="dxa" w:w="2438"/>
+          </w:tcPr>
+          <w:p>
+            <w:r>
+              <w:rPr>
+                <w:sz w:val="18"/>
+              </w:rPr>
+              <w:t>Detección propia en navegador</w:t>
+            </w:r>
+          </w:p>
+        </w:tc>
+        <w:tc>
+          <w:tcPr>
+            <w:tcW w:type="dxa" w:w="1701"/>
+          </w:tcPr>
+          <w:p>
+            <w:r>
+              <w:rPr>
+                <w:sz w:val="18"/>
+              </w:rPr>
+              <w:t>No</w:t>
+            </w:r>
+          </w:p>
+        </w:tc>
+        <w:tc>
+          <w:tcPr>
+            <w:tcW w:type="dxa" w:w="5102"/>
+          </w:tcPr>
+          <w:p>
+            <w:r>
+              <w:rPr>
+                <w:sz w:val="18"/>
+              </w:rPr>
+              <w:t>El navegador no procesa MiniSEED ni decide si ocurrió un sismo.</w:t>
+            </w:r>
+          </w:p>
+        </w:tc>
+      </w:tr>
+      <w:tr>
+        <w:tc>
+          <w:tcPr>
+            <w:tcW w:type="dxa" w:w="2438"/>
+          </w:tcPr>
+          <w:p>
+            <w:r>
+              <w:rPr>
+                <w:sz w:val="18"/>
+              </w:rPr>
+              <w:t>Alerta oficial</w:t>
+            </w:r>
+          </w:p>
+        </w:tc>
+        <w:tc>
+          <w:tcPr>
+            <w:tcW w:type="dxa" w:w="1701"/>
+          </w:tcPr>
+          <w:p>
+            <w:r>
+              <w:rPr>
+                <w:sz w:val="18"/>
+              </w:rPr>
+              <w:t>No</w:t>
+            </w:r>
+          </w:p>
+        </w:tc>
+        <w:tc>
+          <w:tcPr>
+            <w:tcW w:type="dxa" w:w="5102"/>
+          </w:tcPr>
+          <w:p>
+            <w:r>
+              <w:rPr>
+                <w:sz w:val="18"/>
+              </w:rPr>
+              <w:t>Los resultados experimentales no reemplazan ni retrasan publicaciones institucionales.</w:t>
+            </w:r>
+          </w:p>
+        </w:tc>
+      </w:tr>
+    </w:tbl>
+    <w:p/>
+    <w:p>
+      <w:pPr>
+        <w:pStyle w:val="Heading2"/>
+      </w:pPr>
+      <w:r>
+        <w:t>18.2 Interacción y representación</w:t>
+      </w:r>
+    </w:p>
+    <w:p>
+      <w:pPr>
+        <w:pStyle w:val="ListBullet"/>
+      </w:pPr>
+      <w:r>
+        <w:t>Las estaciones se representan mediante símbolos triangulares estables sobre el globo 3D.</w:t>
+      </w:r>
+    </w:p>
+    <w:p>
+      <w:pPr>
+        <w:pStyle w:val="ListBullet"/>
+      </w:pPr>
+      <w:r>
+        <w:t>El color indica estado operativo o activación, no una intensidad sísmica oficial.</w:t>
+      </w:r>
+    </w:p>
+    <w:p>
+      <w:pPr>
+        <w:pStyle w:val="ListBullet"/>
+      </w:pPr>
+      <w:r>
+        <w:t>La selección de una estación presenta red, código, ubicación, latencia y última observación.</w:t>
+      </w:r>
+    </w:p>
+    <w:p>
+      <w:pPr>
+        <w:pStyle w:val="ListBullet"/>
+      </w:pPr>
+      <w:r>
+        <w:t>Los frentes P y S se sincronizan con la hora de origen del evento y se identifican como estimaciones.</w:t>
+      </w:r>
+    </w:p>
+    <w:p>
+      <w:pPr>
+        <w:pStyle w:val="ListBullet"/>
+      </w:pPr>
+      <w:r>
+        <w:t>El usuario puede ocultar estaciones para preservar legibilidad y rendimiento del mapa.</w:t>
+      </w:r>
+    </w:p>
+    <w:p>
+      <w:pPr>
+        <w:pStyle w:val="Heading2"/>
+      </w:pPr>
+      <w:r>
+        <w:t>18.3 Principios de uso responsable</w:t>
+      </w:r>
+    </w:p>
+    <w:p>
+      <w:pPr>
+        <w:pStyle w:val="ListBullet"/>
+      </w:pPr>
+      <w:r>
+        <w:t>Mantener separación explícita entre eventos oficiales y orígenes experimentales.</w:t>
+      </w:r>
+    </w:p>
+    <w:p>
+      <w:pPr>
+        <w:pStyle w:val="ListBullet"/>
+      </w:pPr>
+      <w:r>
+        <w:t>No publicar una advertencia de evacuación, tsunami o daño a partir del motor experimental.</w:t>
+      </w:r>
+    </w:p>
+    <w:p>
+      <w:pPr>
+        <w:pStyle w:val="ListBullet"/>
+      </w:pPr>
+      <w:r>
+        <w:t>Conservar fuente, estación, instante UTC, latencia, algoritmo y versión para auditoría.</w:t>
+      </w:r>
+    </w:p>
+    <w:p>
+      <w:pPr>
+        <w:pStyle w:val="ListBullet"/>
+      </w:pPr>
+      <w:r>
+        <w:t>Operar el procesamiento científico en Linux con software especializado; Node.js integra y distribuye resultados.</w:t>
+      </w:r>
+    </w:p>
+    <w:p>
+      <w:pPr>
+        <w:pStyle w:val="ListBullet"/>
+      </w:pPr>
+      <w:r>
+        <w:t>Validar por reproducción histórica antes de habilitar procesamiento continuo.</w:t>
+      </w:r>
+    </w:p>
+    <w:p>
+      <w:pPr>
+        <w:pStyle w:val="ListBullet"/>
+      </w:pPr>
+      <w:r>
+        <w:t>No copiar código ni interfaz de GlobalQuake 1.1.2; su desarrollo posterior a 1.0 es propietario.</w:t>
+      </w:r>
+    </w:p>
+    <w:p>
+      <w:pPr>
+        <w:pStyle w:val="Heading2"/>
+      </w:pPr>
+      <w:r>
+        <w:t>18.4 Fuentes y dependencia institucional</w:t>
+      </w:r>
+    </w:p>
+    <w:p>
+      <w:r>
+        <w:t>GEOFON ofrece metadatos FDSN y un servicio SeedLink público para estaciones abiertas. EarthScope distribuye datos abiertos en tiempo casi real y metadatos StationXML. El IGP confirma transmisión en tiempo real dentro de la Red Sísmica Nacional, pero no publica un endpoint SeedLink documentado para consumo general; una integración directa con estaciones peruanas requiere coordinación institucional.</w:t>
+      </w:r>
+    </w:p>
+    <w:p>
+      <w:pPr>
+        <w:pStyle w:val="Heading2"/>
+      </w:pPr>
+      <w:r>
+        <w:t>18.5 Trazabilidad</w:t>
+      </w:r>
+    </w:p>
+    <w:p>
+      <w:r>
+        <w:t>La especificación técnica vinculante es SDD-014. Las pruebas previstas se registran en TEST-014 y la evidencia ejecutada en VALIDATION-014. El módulo permanece identificado como experimental hasta superar validación histórica, revisión sismológica y evaluación operativa.</w:t>
+      </w:r>
+    </w:p>
+    <w:p>
+      <w:pPr>
+        <w:pStyle w:val="Heading2"/>
+      </w:pPr>
+      <w:r>
+        <w:t>18.6 Referencias</w:t>
+      </w:r>
+    </w:p>
+    <w:p>
+      <w:pPr>
+        <w:pStyle w:val="ListBullet"/>
+      </w:pPr>
+      <w:r>
+        <w:t>GEOFON SeedLink: https://geofon.gfz.de/waveform/seedlink.php</w:t>
+      </w:r>
+    </w:p>
+    <w:p>
+      <w:pPr>
+        <w:pStyle w:val="ListBullet"/>
+      </w:pPr>
+      <w:r>
+        <w:t>GEOFON FDSN Station: https://geofon.gfz.de/fdsnws/station/1/</w:t>
+      </w:r>
+    </w:p>
+    <w:p>
+      <w:pPr>
+        <w:pStyle w:val="ListBullet"/>
+      </w:pPr>
+      <w:r>
+        <w:t>FDSN StationXML: https://www.fdsn.org/xml/station/</w:t>
+      </w:r>
+    </w:p>
+    <w:p>
+      <w:pPr>
+        <w:pStyle w:val="ListBullet"/>
+      </w:pPr>
+      <w:r>
+        <w:t>SeisComP scautopick: https://docs.gempa.de/seiscomp/current/apps/scautopick.html</w:t>
+      </w:r>
+    </w:p>
+    <w:p>
+      <w:pPr>
+        <w:pStyle w:val="ListBullet"/>
+      </w:pPr>
+      <w:r>
+        <w:t>SeisComP scautoloc: https://docs.gempa.de/seiscomp/current/apps/scautoloc.html</w:t>
+      </w:r>
+    </w:p>
+    <w:p>
+      <w:pPr>
+        <w:pStyle w:val="ListBullet"/>
+      </w:pPr>
+      <w:r>
+        <w:t>IGP Red Sísmica Nacional: https://ultimosismo.igp.gob.pe/red-sismica-nacional</w:t>
       </w:r>
     </w:p>
     <w:sectPr>

</xml_diff>